<commit_message>
feat(insights): luật RFM kết hợp recency + tần suất, xếp hạng theo tập huấn luyện; khoảng tin cậy Holt-Winters bằng mô phỏng
- churn.py: RFMRule (0,7·hạng% recency + 0,3·hạng% tần suất thấp), fit trên tập huấn luyện → AUC 0,768 → 0,791
- forecast.py: Holt-Winters lấy khoảng tin cậy 95% bằng simulate 1.000 lần (rộng dần theo số tháng), lỗi thì quay về ±1,96σ
- Thêm 3 test; chạy lại batch 20261017-170211; cập nhật số liệu, ảnh và file Word checklist 05
</commit_message>
<xml_diff>
--- a/docs/th2/bao_cao/BaoCao_Checklist05_DanhGiaMoHinh.docx
+++ b/docs/th2/bao_cao/BaoCao_Checklist05_DanhGiaMoHinh.docx
@@ -345,7 +345,7 @@
           <w:sz w:val="24"/>
           <w:szCs w:val="24"/>
         </w:rPr>
-        <w:t xml:space="preserve">20261017-072049</w:t>
+        <w:t xml:space="preserve">20261017-170211</w:t>
       </w:r>
       <w:r>
         <w:rPr>
@@ -2362,7 +2362,7 @@
                 <w:sz w:val="22"/>
                 <w:szCs w:val="22"/>
               </w:rPr>
-              <w:t xml:space="preserve">Random Forest</w:t>
+              <w:t xml:space="preserve">Luật RFM</w:t>
             </w:r>
           </w:p>
         </w:tc>
@@ -2396,7 +2396,7 @@
                 <w:sz w:val="22"/>
                 <w:szCs w:val="22"/>
               </w:rPr>
-              <w:t xml:space="preserve">0,782</w:t>
+              <w:t xml:space="preserve">0,791</w:t>
             </w:r>
           </w:p>
         </w:tc>
@@ -2430,7 +2430,7 @@
                 <w:sz w:val="22"/>
                 <w:szCs w:val="22"/>
               </w:rPr>
-              <w:t xml:space="preserve">67,3%</w:t>
+              <w:t xml:space="preserve">71,2%</w:t>
             </w:r>
           </w:p>
         </w:tc>
@@ -2464,7 +2464,7 @@
                 <w:sz w:val="22"/>
                 <w:szCs w:val="22"/>
               </w:rPr>
-              <w:t xml:space="preserve">76,4%</w:t>
+              <w:t xml:space="preserve">69,4%</w:t>
             </w:r>
           </w:p>
         </w:tc>
@@ -2498,7 +2498,7 @@
                 <w:sz w:val="22"/>
                 <w:szCs w:val="22"/>
               </w:rPr>
-              <w:t xml:space="preserve">0,716</w:t>
+              <w:t xml:space="preserve">0,703</w:t>
             </w:r>
           </w:p>
         </w:tc>
@@ -2532,7 +2532,7 @@
                 <w:sz w:val="22"/>
                 <w:szCs w:val="22"/>
               </w:rPr>
-              <w:t xml:space="preserve">71,0%</w:t>
+              <w:t xml:space="preserve">72,0%</w:t>
             </w:r>
           </w:p>
         </w:tc>
@@ -2571,7 +2571,7 @@
                 <w:sz w:val="22"/>
                 <w:szCs w:val="22"/>
               </w:rPr>
-              <w:t xml:space="preserve">Luật RFM</w:t>
+              <w:t xml:space="preserve">Random Forest</w:t>
             </w:r>
           </w:p>
         </w:tc>
@@ -2605,7 +2605,7 @@
                 <w:sz w:val="22"/>
                 <w:szCs w:val="22"/>
               </w:rPr>
-              <w:t xml:space="preserve">0,768</w:t>
+              <w:t xml:space="preserve">0,782</w:t>
             </w:r>
           </w:p>
         </w:tc>
@@ -2639,7 +2639,7 @@
                 <w:sz w:val="22"/>
                 <w:szCs w:val="22"/>
               </w:rPr>
-              <w:t xml:space="preserve">66,9%</w:t>
+              <w:t xml:space="preserve">67,3%</w:t>
             </w:r>
           </w:p>
         </w:tc>
@@ -2673,7 +2673,7 @@
                 <w:sz w:val="22"/>
                 <w:szCs w:val="22"/>
               </w:rPr>
-              <w:t xml:space="preserve">70,3%</w:t>
+              <w:t xml:space="preserve">76,4%</w:t>
             </w:r>
           </w:p>
         </w:tc>
@@ -2707,7 +2707,7 @@
                 <w:sz w:val="22"/>
                 <w:szCs w:val="22"/>
               </w:rPr>
-              <w:t xml:space="preserve">0,685</w:t>
+              <w:t xml:space="preserve">0,716</w:t>
             </w:r>
           </w:p>
         </w:tc>
@@ -2741,7 +2741,7 @@
                 <w:sz w:val="22"/>
                 <w:szCs w:val="22"/>
               </w:rPr>
-              <w:t xml:space="preserve">69,2%</w:t>
+              <w:t xml:space="preserve">71,0%</w:t>
             </w:r>
           </w:p>
         </w:tc>
@@ -6272,7 +6272,7 @@
                 <w:sz w:val="21"/>
                 <w:szCs w:val="21"/>
               </w:rPr>
-              <w:t xml:space="preserve">0,810 · 0,782 · 0,768</w:t>
+              <w:t xml:space="preserve">0,810 · 0,791 · 0,782</w:t>
             </w:r>
           </w:p>
         </w:tc>
@@ -6306,7 +6306,7 @@
                 <w:sz w:val="21"/>
                 <w:szCs w:val="21"/>
               </w:rPr>
-              <w:t xml:space="preserve">0,8102 · 0,7820 · 0,7677</w:t>
+              <w:t xml:space="preserve">0,8102 · 0,7907 · 0,7820</w:t>
             </w:r>
           </w:p>
         </w:tc>
@@ -7671,6 +7671,288 @@
                 <w:szCs w:val="21"/>
               </w:rPr>
               <w:t xml:space="preserve">Đã sửa</w:t>
+            </w:r>
+          </w:p>
+        </w:tc>
+      </w:tr>
+      <w:tr>
+        <w:trPr>
+          <w:cantSplit/>
+        </w:trPr>
+        <w:tc>
+          <w:tcPr>
+            <w:tcW w:type="dxa" w:w="600"/>
+            <w:tcBorders>
+              <w:top w:val="single" w:color="CBD5E1" w:sz="4"/>
+              <w:left w:val="single" w:color="CBD5E1" w:sz="4"/>
+              <w:bottom w:val="single" w:color="CBD5E1" w:sz="4"/>
+              <w:right w:val="single" w:color="CBD5E1" w:sz="4"/>
+            </w:tcBorders>
+            <w:shd w:fill="F8FAFC" w:color="auto" w:val="clear"/>
+            <w:tcMar>
+              <w:top w:type="dxa" w:w="90"/>
+              <w:left w:type="dxa" w:w="120"/>
+              <w:bottom w:type="dxa" w:w="90"/>
+              <w:right w:type="dxa" w:w="120"/>
+            </w:tcMar>
+          </w:tcPr>
+          <w:p>
+            <w:pPr>
+              <w:spacing w:before="0" w:after="0" w:line="276"/>
+              <w:jc w:val="left"/>
+            </w:pPr>
+            <w:r>
+              <w:rPr>
+                <w:rFonts w:ascii="Arial" w:cs="Arial" w:eastAsia="Arial" w:hAnsi="Arial"/>
+                <w:b w:val="false"/>
+                <w:bCs w:val="false"/>
+                <w:sz w:val="21"/>
+                <w:szCs w:val="21"/>
+              </w:rPr>
+              <w:t xml:space="preserve">8</w:t>
+            </w:r>
+          </w:p>
+        </w:tc>
+        <w:tc>
+          <w:tcPr>
+            <w:tcW w:type="dxa" w:w="5806"/>
+            <w:tcBorders>
+              <w:top w:val="single" w:color="CBD5E1" w:sz="4"/>
+              <w:left w:val="single" w:color="CBD5E1" w:sz="4"/>
+              <w:bottom w:val="single" w:color="CBD5E1" w:sz="4"/>
+              <w:right w:val="single" w:color="CBD5E1" w:sz="4"/>
+            </w:tcBorders>
+            <w:shd w:fill="F8FAFC" w:color="auto" w:val="clear"/>
+            <w:tcMar>
+              <w:top w:type="dxa" w:w="90"/>
+              <w:left w:type="dxa" w:w="120"/>
+              <w:bottom w:type="dxa" w:w="90"/>
+              <w:right w:type="dxa" w:w="120"/>
+            </w:tcMar>
+          </w:tcPr>
+          <w:p>
+            <w:pPr>
+              <w:spacing w:before="0" w:after="0" w:line="276"/>
+              <w:jc w:val="left"/>
+            </w:pPr>
+            <w:r>
+              <w:rPr>
+                <w:rFonts w:ascii="Arial" w:cs="Arial" w:eastAsia="Arial" w:hAnsi="Arial"/>
+                <w:b w:val="false"/>
+                <w:bCs w:val="false"/>
+                <w:sz w:val="21"/>
+                <w:szCs w:val="21"/>
+              </w:rPr>
+              <w:t xml:space="preserve">Luật RFM chỉ dùng recency, xếp hạng lại theo từng tập chấm</w:t>
+            </w:r>
+          </w:p>
+        </w:tc>
+        <w:tc>
+          <w:tcPr>
+            <w:tcW w:type="dxa" w:w="1700"/>
+            <w:tcBorders>
+              <w:top w:val="single" w:color="CBD5E1" w:sz="4"/>
+              <w:left w:val="single" w:color="CBD5E1" w:sz="4"/>
+              <w:bottom w:val="single" w:color="CBD5E1" w:sz="4"/>
+              <w:right w:val="single" w:color="CBD5E1" w:sz="4"/>
+            </w:tcBorders>
+            <w:shd w:fill="F8FAFC" w:color="auto" w:val="clear"/>
+            <w:tcMar>
+              <w:top w:type="dxa" w:w="90"/>
+              <w:left w:type="dxa" w:w="120"/>
+              <w:bottom w:type="dxa" w:w="90"/>
+              <w:right w:type="dxa" w:w="120"/>
+            </w:tcMar>
+          </w:tcPr>
+          <w:p>
+            <w:pPr>
+              <w:spacing w:before="0" w:after="0" w:line="276"/>
+              <w:jc w:val="left"/>
+            </w:pPr>
+            <w:r>
+              <w:rPr>
+                <w:rFonts w:ascii="Arial" w:cs="Arial" w:eastAsia="Arial" w:hAnsi="Arial"/>
+                <w:b w:val="false"/>
+                <w:bCs w:val="false"/>
+                <w:sz w:val="21"/>
+                <w:szCs w:val="21"/>
+              </w:rPr>
+              <w:t xml:space="preserve">Rời bỏ</w:t>
+            </w:r>
+          </w:p>
+        </w:tc>
+        <w:tc>
+          <w:tcPr>
+            <w:tcW w:type="dxa" w:w="1800"/>
+            <w:tcBorders>
+              <w:top w:val="single" w:color="CBD5E1" w:sz="4"/>
+              <w:left w:val="single" w:color="CBD5E1" w:sz="4"/>
+              <w:bottom w:val="single" w:color="CBD5E1" w:sz="4"/>
+              <w:right w:val="single" w:color="CBD5E1" w:sz="4"/>
+            </w:tcBorders>
+            <w:shd w:fill="F8FAFC" w:color="auto" w:val="clear"/>
+            <w:tcMar>
+              <w:top w:type="dxa" w:w="90"/>
+              <w:left w:type="dxa" w:w="120"/>
+              <w:bottom w:type="dxa" w:w="90"/>
+              <w:right w:type="dxa" w:w="120"/>
+            </w:tcMar>
+          </w:tcPr>
+          <w:p>
+            <w:pPr>
+              <w:spacing w:before="0" w:after="0" w:line="276"/>
+              <w:jc w:val="left"/>
+            </w:pPr>
+            <w:r>
+              <w:rPr>
+                <w:rFonts w:ascii="Arial" w:cs="Arial" w:eastAsia="Arial" w:hAnsi="Arial"/>
+                <w:b w:val="false"/>
+                <w:bCs w:val="false"/>
+                <w:sz w:val="21"/>
+                <w:szCs w:val="21"/>
+              </w:rPr>
+              <w:t xml:space="preserve">Cải tiến → AUC 0,791</w:t>
+            </w:r>
+          </w:p>
+        </w:tc>
+      </w:tr>
+      <w:tr>
+        <w:trPr>
+          <w:cantSplit/>
+        </w:trPr>
+        <w:tc>
+          <w:tcPr>
+            <w:tcW w:type="dxa" w:w="600"/>
+            <w:tcBorders>
+              <w:top w:val="single" w:color="CBD5E1" w:sz="4"/>
+              <w:left w:val="single" w:color="CBD5E1" w:sz="4"/>
+              <w:bottom w:val="single" w:color="CBD5E1" w:sz="4"/>
+              <w:right w:val="single" w:color="CBD5E1" w:sz="4"/>
+            </w:tcBorders>
+            <w:shd w:fill="FFFFFF" w:color="auto" w:val="clear"/>
+            <w:tcMar>
+              <w:top w:type="dxa" w:w="90"/>
+              <w:left w:type="dxa" w:w="120"/>
+              <w:bottom w:type="dxa" w:w="90"/>
+              <w:right w:type="dxa" w:w="120"/>
+            </w:tcMar>
+          </w:tcPr>
+          <w:p>
+            <w:pPr>
+              <w:spacing w:before="0" w:after="0" w:line="276"/>
+              <w:jc w:val="left"/>
+            </w:pPr>
+            <w:r>
+              <w:rPr>
+                <w:rFonts w:ascii="Arial" w:cs="Arial" w:eastAsia="Arial" w:hAnsi="Arial"/>
+                <w:b w:val="false"/>
+                <w:bCs w:val="false"/>
+                <w:sz w:val="21"/>
+                <w:szCs w:val="21"/>
+              </w:rPr>
+              <w:t xml:space="preserve">9</w:t>
+            </w:r>
+          </w:p>
+        </w:tc>
+        <w:tc>
+          <w:tcPr>
+            <w:tcW w:type="dxa" w:w="5806"/>
+            <w:tcBorders>
+              <w:top w:val="single" w:color="CBD5E1" w:sz="4"/>
+              <w:left w:val="single" w:color="CBD5E1" w:sz="4"/>
+              <w:bottom w:val="single" w:color="CBD5E1" w:sz="4"/>
+              <w:right w:val="single" w:color="CBD5E1" w:sz="4"/>
+            </w:tcBorders>
+            <w:shd w:fill="FFFFFF" w:color="auto" w:val="clear"/>
+            <w:tcMar>
+              <w:top w:type="dxa" w:w="90"/>
+              <w:left w:type="dxa" w:w="120"/>
+              <w:bottom w:type="dxa" w:w="90"/>
+              <w:right w:type="dxa" w:w="120"/>
+            </w:tcMar>
+          </w:tcPr>
+          <w:p>
+            <w:pPr>
+              <w:spacing w:before="0" w:after="0" w:line="276"/>
+              <w:jc w:val="left"/>
+            </w:pPr>
+            <w:r>
+              <w:rPr>
+                <w:rFonts w:ascii="Arial" w:cs="Arial" w:eastAsia="Arial" w:hAnsi="Arial"/>
+                <w:b w:val="false"/>
+                <w:bCs w:val="false"/>
+                <w:sz w:val="21"/>
+                <w:szCs w:val="21"/>
+              </w:rPr>
+              <w:t xml:space="preserve">Khoảng tin cậy Holt-Winters cố định ±1,96σ</w:t>
+            </w:r>
+          </w:p>
+        </w:tc>
+        <w:tc>
+          <w:tcPr>
+            <w:tcW w:type="dxa" w:w="1700"/>
+            <w:tcBorders>
+              <w:top w:val="single" w:color="CBD5E1" w:sz="4"/>
+              <w:left w:val="single" w:color="CBD5E1" w:sz="4"/>
+              <w:bottom w:val="single" w:color="CBD5E1" w:sz="4"/>
+              <w:right w:val="single" w:color="CBD5E1" w:sz="4"/>
+            </w:tcBorders>
+            <w:shd w:fill="FFFFFF" w:color="auto" w:val="clear"/>
+            <w:tcMar>
+              <w:top w:type="dxa" w:w="90"/>
+              <w:left w:type="dxa" w:w="120"/>
+              <w:bottom w:type="dxa" w:w="90"/>
+              <w:right w:type="dxa" w:w="120"/>
+            </w:tcMar>
+          </w:tcPr>
+          <w:p>
+            <w:pPr>
+              <w:spacing w:before="0" w:after="0" w:line="276"/>
+              <w:jc w:val="left"/>
+            </w:pPr>
+            <w:r>
+              <w:rPr>
+                <w:rFonts w:ascii="Arial" w:cs="Arial" w:eastAsia="Arial" w:hAnsi="Arial"/>
+                <w:b w:val="false"/>
+                <w:bCs w:val="false"/>
+                <w:sz w:val="21"/>
+                <w:szCs w:val="21"/>
+              </w:rPr>
+              <w:t xml:space="preserve">Dự báo</w:t>
+            </w:r>
+          </w:p>
+        </w:tc>
+        <w:tc>
+          <w:tcPr>
+            <w:tcW w:type="dxa" w:w="1800"/>
+            <w:tcBorders>
+              <w:top w:val="single" w:color="CBD5E1" w:sz="4"/>
+              <w:left w:val="single" w:color="CBD5E1" w:sz="4"/>
+              <w:bottom w:val="single" w:color="CBD5E1" w:sz="4"/>
+              <w:right w:val="single" w:color="CBD5E1" w:sz="4"/>
+            </w:tcBorders>
+            <w:shd w:fill="FFFFFF" w:color="auto" w:val="clear"/>
+            <w:tcMar>
+              <w:top w:type="dxa" w:w="90"/>
+              <w:left w:type="dxa" w:w="120"/>
+              <w:bottom w:type="dxa" w:w="90"/>
+              <w:right w:type="dxa" w:w="120"/>
+            </w:tcMar>
+          </w:tcPr>
+          <w:p>
+            <w:pPr>
+              <w:spacing w:before="0" w:after="0" w:line="276"/>
+              <w:jc w:val="left"/>
+            </w:pPr>
+            <w:r>
+              <w:rPr>
+                <w:rFonts w:ascii="Arial" w:cs="Arial" w:eastAsia="Arial" w:hAnsi="Arial"/>
+                <w:b w:val="false"/>
+                <w:bCs w:val="false"/>
+                <w:sz w:val="21"/>
+                <w:szCs w:val="21"/>
+              </w:rPr>
+              <w:t xml:space="preserve">Cải tiến → mô phỏng 1.000 lần</w:t>
             </w:r>
           </w:p>
         </w:tc>

</xml_diff>